<commit_message>
dodano dyskusje, wnioski, zrodla
</commit_message>
<xml_diff>
--- a/kupa.docx
+++ b/kupa.docx
@@ -22,7 +22,11 @@
         <w:br/>
       </w:r>
       <w:r>
-        <w:t>Odra jest jedną z najbar</w:t>
+        <w:t xml:space="preserve">Odra jest jedną z </w:t>
+      </w:r>
+      <w:proofErr w:type="spellStart"/>
+      <w:r>
+        <w:t>najbar</w:t>
       </w:r>
       <w:r>
         <w:rPr>
@@ -40,7 +44,15 @@
         <w:t>͏</w:t>
       </w:r>
       <w:r>
-        <w:t>iej zara</w:t>
+        <w:t>iej</w:t>
+      </w:r>
+      <w:proofErr w:type="spellEnd"/>
+      <w:r>
+        <w:t xml:space="preserve"> </w:t>
+      </w:r>
+      <w:proofErr w:type="spellStart"/>
+      <w:r>
+        <w:t>zara</w:t>
       </w:r>
       <w:r>
         <w:rPr>
@@ -58,7 +70,11 @@
         <w:t>͏</w:t>
       </w:r>
       <w:r>
-        <w:t>ch chor</w:t>
+        <w:t>ch</w:t>
+      </w:r>
+      <w:proofErr w:type="spellEnd"/>
+      <w:r>
+        <w:t xml:space="preserve"> chor</w:t>
       </w:r>
       <w:r>
         <w:rPr>
@@ -76,7 +92,11 @@
         <w:t>͏</w:t>
       </w:r>
       <w:r>
-        <w:t xml:space="preserve"> ludziach zal</w:t>
+        <w:t xml:space="preserve"> ludziach </w:t>
+      </w:r>
+      <w:proofErr w:type="spellStart"/>
+      <w:r>
+        <w:t>zal</w:t>
       </w:r>
       <w:r>
         <w:rPr>
@@ -94,7 +114,15 @@
         <w:t>ż</w:t>
       </w:r>
       <w:r>
-        <w:t>y od poziomu odporno</w:t>
+        <w:t>y</w:t>
+      </w:r>
+      <w:proofErr w:type="spellEnd"/>
+      <w:r>
+        <w:t xml:space="preserve"> od poziomu </w:t>
+      </w:r>
+      <w:proofErr w:type="spellStart"/>
+      <w:r>
+        <w:t>odporno</w:t>
       </w:r>
       <w:r>
         <w:rPr>
@@ -112,7 +140,11 @@
         <w:t>͏</w:t>
       </w:r>
       <w:r>
-        <w:t xml:space="preserve">i w grupach. Mimo </w:t>
+        <w:t>i</w:t>
+      </w:r>
+      <w:proofErr w:type="spellEnd"/>
+      <w:r>
+        <w:t xml:space="preserve"> w grupach. Mimo </w:t>
       </w:r>
       <w:r>
         <w:rPr>
@@ -184,7 +216,11 @@
         <w:t>͏</w:t>
       </w:r>
       <w:r>
-        <w:t xml:space="preserve"> zachorowa</w:t>
+        <w:t xml:space="preserve"> </w:t>
+      </w:r>
+      <w:proofErr w:type="spellStart"/>
+      <w:r>
+        <w:t>zachorowa</w:t>
       </w:r>
       <w:r>
         <w:rPr>
@@ -192,8 +228,13 @@
         </w:rPr>
         <w:t>ń</w:t>
       </w:r>
-      <w:r>
-        <w:t xml:space="preserve"> w krajach europejskich. To zdarzenie pasuje do tren</w:t>
+      <w:proofErr w:type="spellEnd"/>
+      <w:r>
+        <w:t xml:space="preserve"> w krajach europejskich. To zdarzenie pasuje do </w:t>
+      </w:r>
+      <w:proofErr w:type="spellStart"/>
+      <w:r>
+        <w:t>tren</w:t>
       </w:r>
       <w:r>
         <w:rPr>
@@ -211,7 +252,11 @@
         <w:t>ó</w:t>
       </w:r>
       <w:r>
-        <w:t>w opisanych w najnowszych raport</w:t>
+        <w:t>w</w:t>
+      </w:r>
+      <w:proofErr w:type="spellEnd"/>
+      <w:r>
+        <w:t xml:space="preserve"> opisanych w najnowszych raport</w:t>
       </w:r>
       <w:r>
         <w:rPr>
@@ -229,7 +274,11 @@
         <w:t>͏</w:t>
       </w:r>
       <w:r>
-        <w:t>CDC oraz WHO kt</w:t>
+        <w:t xml:space="preserve">CDC oraz WHO </w:t>
+      </w:r>
+      <w:proofErr w:type="spellStart"/>
+      <w:r>
+        <w:t>kt</w:t>
       </w:r>
       <w:r>
         <w:rPr>
@@ -247,7 +296,11 @@
         <w:t>͏</w:t>
       </w:r>
       <w:r>
-        <w:t>e pokazuj</w:t>
+        <w:t>e</w:t>
+      </w:r>
+      <w:proofErr w:type="spellEnd"/>
+      <w:r>
+        <w:t xml:space="preserve"> pokazuj</w:t>
       </w:r>
       <w:r>
         <w:rPr>
@@ -274,7 +327,11 @@
         <w:t>ą</w:t>
       </w:r>
       <w:r>
-        <w:t xml:space="preserve"> li</w:t>
+        <w:t xml:space="preserve"> </w:t>
+      </w:r>
+      <w:proofErr w:type="spellStart"/>
+      <w:r>
+        <w:t>li</w:t>
       </w:r>
       <w:r>
         <w:rPr>
@@ -291,6 +348,7 @@
         </w:rPr>
         <w:t>ę</w:t>
       </w:r>
+      <w:proofErr w:type="spellEnd"/>
       <w:r>
         <w:rPr>
           <w:rFonts w:ascii="Arial" w:hAnsi="Arial" w:cs="Arial"/>
@@ -307,7 +365,11 @@
         <w:t>͏</w:t>
       </w:r>
       <w:r>
-        <w:t xml:space="preserve"> liczba zaszcz</w:t>
+        <w:t xml:space="preserve"> liczba </w:t>
+      </w:r>
+      <w:proofErr w:type="spellStart"/>
+      <w:r>
+        <w:t>zaszcz</w:t>
       </w:r>
       <w:r>
         <w:rPr>
@@ -316,7 +378,11 @@
         <w:t>͏</w:t>
       </w:r>
       <w:r>
-        <w:t>epionych spad</w:t>
+        <w:t>epionych</w:t>
+      </w:r>
+      <w:proofErr w:type="spellEnd"/>
+      <w:r>
+        <w:t xml:space="preserve"> spad</w:t>
       </w:r>
       <w:r>
         <w:rPr>
@@ -325,7 +391,11 @@
         <w:t>ł</w:t>
       </w:r>
       <w:r>
-        <w:t>a poni</w:t>
+        <w:t xml:space="preserve">a </w:t>
+      </w:r>
+      <w:proofErr w:type="spellStart"/>
+      <w:r>
+        <w:t>poni</w:t>
       </w:r>
       <w:r>
         <w:rPr>
@@ -340,12 +410,20 @@
         <w:t>͏</w:t>
       </w:r>
       <w:r>
-        <w:t>ej zalecanego poziom 95%.</w:t>
-      </w:r>
-    </w:p>
-    <w:p>
-      <w:r>
-        <w:t>Celem tego opracowania jest bad</w:t>
+        <w:t>ej</w:t>
+      </w:r>
+      <w:proofErr w:type="spellEnd"/>
+      <w:r>
+        <w:t xml:space="preserve"> zalecanego poziom 95%.</w:t>
+      </w:r>
+    </w:p>
+    <w:p>
+      <w:r>
+        <w:t xml:space="preserve">Celem tego opracowania jest </w:t>
+      </w:r>
+      <w:proofErr w:type="spellStart"/>
+      <w:r>
+        <w:t>bad</w:t>
       </w:r>
       <w:r>
         <w:rPr>
@@ -354,7 +432,15 @@
         <w:t>͏</w:t>
       </w:r>
       <w:r>
-        <w:t>anie, ja</w:t>
+        <w:t>anie</w:t>
+      </w:r>
+      <w:proofErr w:type="spellEnd"/>
+      <w:r>
+        <w:t xml:space="preserve">, </w:t>
+      </w:r>
+      <w:proofErr w:type="spellStart"/>
+      <w:r>
+        <w:t>ja</w:t>
       </w:r>
       <w:r>
         <w:rPr>
@@ -363,7 +449,11 @@
         <w:t>͏</w:t>
       </w:r>
       <w:r>
-        <w:t>k zmieniaj</w:t>
+        <w:t>k</w:t>
+      </w:r>
+      <w:proofErr w:type="spellEnd"/>
+      <w:r>
+        <w:t xml:space="preserve"> zmieniaj</w:t>
       </w:r>
       <w:r>
         <w:rPr>
@@ -417,7 +507,31 @@
         <w:t>͏</w:t>
       </w:r>
       <w:r>
-        <w:t xml:space="preserve">danych z ECDC Surveillance Atlas of Infectious Diseases. </w:t>
+        <w:t xml:space="preserve">danych z ECDC </w:t>
+      </w:r>
+      <w:proofErr w:type="spellStart"/>
+      <w:r>
+        <w:t>Surveillance</w:t>
+      </w:r>
+      <w:proofErr w:type="spellEnd"/>
+      <w:r>
+        <w:t xml:space="preserve"> Atlas of </w:t>
+      </w:r>
+      <w:proofErr w:type="spellStart"/>
+      <w:r>
+        <w:t>Infectious</w:t>
+      </w:r>
+      <w:proofErr w:type="spellEnd"/>
+      <w:r>
+        <w:t xml:space="preserve"> </w:t>
+      </w:r>
+      <w:proofErr w:type="spellStart"/>
+      <w:r>
+        <w:t>Diseases</w:t>
+      </w:r>
+      <w:proofErr w:type="spellEnd"/>
+      <w:r>
+        <w:t xml:space="preserve">. </w:t>
       </w:r>
       <w:r>
         <w:rPr>
@@ -426,7 +540,11 @@
         <w:t>͏</w:t>
       </w:r>
       <w:r>
-        <w:t>Zrobiono kilk</w:t>
+        <w:t xml:space="preserve">Zrobiono </w:t>
+      </w:r>
+      <w:proofErr w:type="spellStart"/>
+      <w:r>
+        <w:t>kilk</w:t>
       </w:r>
       <w:r>
         <w:rPr>
@@ -435,7 +553,11 @@
         <w:t>͏</w:t>
       </w:r>
       <w:r>
-        <w:t>a krok</w:t>
+        <w:t>a</w:t>
+      </w:r>
+      <w:proofErr w:type="spellEnd"/>
+      <w:r>
+        <w:t xml:space="preserve"> krok</w:t>
       </w:r>
       <w:r>
         <w:rPr>
@@ -480,7 +602,11 @@
         <w:t>ó</w:t>
       </w:r>
       <w:r>
-        <w:t>w w czasie oraz tworze</w:t>
+        <w:t xml:space="preserve">w w czasie oraz </w:t>
+      </w:r>
+      <w:proofErr w:type="spellStart"/>
+      <w:r>
+        <w:t>tworze</w:t>
       </w:r>
       <w:r>
         <w:rPr>
@@ -489,7 +615,11 @@
         <w:t>͏</w:t>
       </w:r>
       <w:r>
-        <w:t>nie modelu prognozuj</w:t>
+        <w:t>nie</w:t>
+      </w:r>
+      <w:proofErr w:type="spellEnd"/>
+      <w:r>
+        <w:t xml:space="preserve"> modelu prognozuj</w:t>
       </w:r>
       <w:r>
         <w:rPr>
@@ -498,7 +628,11 @@
         <w:t>ą</w:t>
       </w:r>
       <w:r>
-        <w:t>cego oparte</w:t>
+        <w:t xml:space="preserve">cego </w:t>
+      </w:r>
+      <w:proofErr w:type="spellStart"/>
+      <w:r>
+        <w:t>oparte</w:t>
       </w:r>
       <w:r>
         <w:rPr>
@@ -507,7 +641,11 @@
         <w:t>͏</w:t>
       </w:r>
       <w:r>
-        <w:t>go na</w:t>
+        <w:t>go</w:t>
+      </w:r>
+      <w:proofErr w:type="spellEnd"/>
+      <w:r>
+        <w:t xml:space="preserve"> na</w:t>
       </w:r>
       <w:r>
         <w:rPr>
@@ -516,7 +654,11 @@
         <w:t>͏</w:t>
       </w:r>
       <w:r>
-        <w:t xml:space="preserve"> metodach regresji Pois</w:t>
+        <w:t xml:space="preserve"> metodach regresji </w:t>
+      </w:r>
+      <w:proofErr w:type="spellStart"/>
+      <w:r>
+        <w:t>Pois</w:t>
       </w:r>
       <w:r>
         <w:rPr>
@@ -525,7 +667,15 @@
         <w:t>͏</w:t>
       </w:r>
       <w:r>
-        <w:t>sona i regresji negatywno-dwumian</w:t>
+        <w:t>sona</w:t>
+      </w:r>
+      <w:proofErr w:type="spellEnd"/>
+      <w:r>
+        <w:t xml:space="preserve"> i regresji </w:t>
+      </w:r>
+      <w:proofErr w:type="spellStart"/>
+      <w:r>
+        <w:t>negatywno-dwumian</w:t>
       </w:r>
       <w:r>
         <w:rPr>
@@ -534,7 +684,11 @@
         <w:t>͏</w:t>
       </w:r>
       <w:r>
-        <w:t>owej. Te metody s</w:t>
+        <w:t>owej</w:t>
+      </w:r>
+      <w:proofErr w:type="spellEnd"/>
+      <w:r>
+        <w:t>. Te metody s</w:t>
       </w:r>
       <w:r>
         <w:rPr>
@@ -552,7 +706,11 @@
         <w:t>͏</w:t>
       </w:r>
       <w:r>
-        <w:t xml:space="preserve"> za normy pr</w:t>
+        <w:t xml:space="preserve"> za normy </w:t>
+      </w:r>
+      <w:proofErr w:type="spellStart"/>
+      <w:r>
+        <w:t>pr</w:t>
       </w:r>
       <w:r>
         <w:rPr>
@@ -561,7 +719,11 @@
         <w:t>͏</w:t>
       </w:r>
       <w:r>
-        <w:t xml:space="preserve">zy </w:t>
+        <w:t>zy</w:t>
+      </w:r>
+      <w:proofErr w:type="spellEnd"/>
+      <w:r>
+        <w:t xml:space="preserve"> </w:t>
       </w:r>
       <w:r>
         <w:rPr>
@@ -630,8 +792,25 @@
         <w:pStyle w:val="Akapitzlist"/>
       </w:pPr>
       <w:r>
-        <w:t>Dane epidemiologiczne dotyczą liczby potwierdzonych zachorowań („count data”). Takie dane są dyskretne, nieujemne oraz często wykazują nadmierną wariancję (</w:t>
-      </w:r>
+        <w:t xml:space="preserve">Dane epidemiologiczne dotyczą liczby potwierdzonych </w:t>
+      </w:r>
+      <w:proofErr w:type="spellStart"/>
+      <w:r>
+        <w:t>zachorowań</w:t>
+      </w:r>
+      <w:proofErr w:type="spellEnd"/>
+      <w:r>
+        <w:t xml:space="preserve"> („</w:t>
+      </w:r>
+      <w:proofErr w:type="spellStart"/>
+      <w:r>
+        <w:t>count</w:t>
+      </w:r>
+      <w:proofErr w:type="spellEnd"/>
+      <w:r>
+        <w:t xml:space="preserve"> data”). Takie dane są dyskretne, nieujemne oraz często wykazują nadmierną wariancję (</w:t>
+      </w:r>
+      <w:proofErr w:type="spellStart"/>
       <w:r>
         <w:rPr>
           <w:i/>
@@ -639,6 +818,7 @@
         </w:rPr>
         <w:t>overdispersion</w:t>
       </w:r>
+      <w:proofErr w:type="spellEnd"/>
       <w:r>
         <w:t>). Z tego powodu modele liniowe są niewystarczające, a w literaturze preferuje się:</w:t>
       </w:r>
@@ -722,6 +902,7 @@
           <w:szCs w:val="28"/>
         </w:rPr>
       </w:pPr>
+      <w:proofErr w:type="spellStart"/>
       <w:r>
         <w:rPr>
           <w:sz w:val="28"/>
@@ -742,7 +923,23 @@
           <w:sz w:val="28"/>
           <w:szCs w:val="28"/>
         </w:rPr>
-        <w:t>~Poisson(λ</w:t>
+        <w:t>~Poisson</w:t>
+      </w:r>
+      <w:proofErr w:type="spellEnd"/>
+      <w:r>
+        <w:rPr>
+          <w:sz w:val="28"/>
+          <w:szCs w:val="28"/>
+        </w:rPr>
+        <w:t>(</w:t>
+      </w:r>
+      <w:proofErr w:type="spellStart"/>
+      <w:r>
+        <w:rPr>
+          <w:sz w:val="28"/>
+          <w:szCs w:val="28"/>
+        </w:rPr>
+        <w:t>λ</w:t>
       </w:r>
       <w:r>
         <w:rPr>
@@ -752,6 +949,7 @@
         </w:rPr>
         <w:t>t</w:t>
       </w:r>
+      <w:proofErr w:type="spellEnd"/>
       <w:r>
         <w:rPr>
           <w:sz w:val="28"/>
@@ -774,7 +972,15 @@
           <w:sz w:val="28"/>
           <w:szCs w:val="28"/>
         </w:rPr>
-        <w:t>log(λ</w:t>
+        <w:t>log(</w:t>
+      </w:r>
+      <w:proofErr w:type="spellStart"/>
+      <w:r>
+        <w:rPr>
+          <w:sz w:val="28"/>
+          <w:szCs w:val="28"/>
+        </w:rPr>
+        <w:t>λ</w:t>
       </w:r>
       <w:r>
         <w:rPr>
@@ -784,6 +990,7 @@
         </w:rPr>
         <w:t>t</w:t>
       </w:r>
+      <w:proofErr w:type="spellEnd"/>
       <w:r>
         <w:rPr>
           <w:sz w:val="28"/>
@@ -846,7 +1053,22 @@
           <w:sz w:val="28"/>
           <w:szCs w:val="28"/>
         </w:rPr>
-        <w:t xml:space="preserve"> </w:t>
+        <w:t xml:space="preserve"> β</w:t>
+      </w:r>
+      <w:r>
+        <w:rPr>
+          <w:sz w:val="28"/>
+          <w:szCs w:val="28"/>
+          <w:vertAlign w:val="subscript"/>
+        </w:rPr>
+        <w:t>2</w:t>
+      </w:r>
+      <w:r>
+        <w:rPr>
+          <w:sz w:val="28"/>
+          <w:szCs w:val="28"/>
+        </w:rPr>
+        <w:t>•</w:t>
       </w:r>
       <w:r>
         <w:rPr>
@@ -855,22 +1077,7 @@
           <w:sz w:val="28"/>
           <w:szCs w:val="28"/>
         </w:rPr>
-        <w:t>β</w:t>
-      </w:r>
-      <w:r>
-        <w:rPr>
-          <w:sz w:val="28"/>
-          <w:szCs w:val="28"/>
-          <w:vertAlign w:val="subscript"/>
-        </w:rPr>
-        <w:t>2</w:t>
-      </w:r>
-      <w:r>
-        <w:rPr>
-          <w:sz w:val="28"/>
-          <w:szCs w:val="28"/>
-        </w:rPr>
-        <w:t>•</w:t>
+        <w:t>VaccinationRate</w:t>
       </w:r>
       <w:r>
         <w:rPr>
@@ -878,8 +1085,16 @@
           <w:iCs/>
           <w:sz w:val="28"/>
           <w:szCs w:val="28"/>
-        </w:rPr>
-        <w:t>VaccinationRate</w:t>
+          <w:vertAlign w:val="subscript"/>
+        </w:rPr>
+        <w:t>t</w:t>
+      </w:r>
+      <w:r>
+        <w:rPr>
+          <w:sz w:val="28"/>
+          <w:szCs w:val="28"/>
+        </w:rPr>
+        <w:t>+</w:t>
       </w:r>
       <w:r>
         <w:rPr>
@@ -887,34 +1102,8 @@
           <w:iCs/>
           <w:sz w:val="28"/>
           <w:szCs w:val="28"/>
-          <w:vertAlign w:val="subscript"/>
-        </w:rPr>
-        <w:t>t</w:t>
-      </w:r>
-      <w:r>
-        <w:rPr>
-          <w:sz w:val="28"/>
-          <w:szCs w:val="28"/>
-        </w:rPr>
-        <w:t>+</w:t>
-      </w:r>
-      <w:r>
-        <w:rPr>
-          <w:i/>
-          <w:iCs/>
-          <w:sz w:val="28"/>
-          <w:szCs w:val="28"/>
-        </w:rPr>
-        <w:t xml:space="preserve"> </w:t>
-      </w:r>
-      <w:r>
-        <w:rPr>
-          <w:i/>
-          <w:iCs/>
-          <w:sz w:val="28"/>
-          <w:szCs w:val="28"/>
-        </w:rPr>
-        <w:t>β</w:t>
+        </w:rPr>
+        <w:t xml:space="preserve"> β</w:t>
       </w:r>
       <w:r>
         <w:rPr>
@@ -1113,6 +1302,7 @@
           <w:szCs w:val="28"/>
         </w:rPr>
       </w:pPr>
+      <w:proofErr w:type="spellStart"/>
       <w:r>
         <w:rPr>
           <w:i/>
@@ -1122,6 +1312,7 @@
         </w:rPr>
         <w:t>VaccinationRate</w:t>
       </w:r>
+      <w:proofErr w:type="spellEnd"/>
       <w:r>
         <w:rPr>
           <w:sz w:val="28"/>
@@ -1155,6 +1346,7 @@
           <w:szCs w:val="28"/>
         </w:rPr>
       </w:pPr>
+      <w:proofErr w:type="spellStart"/>
       <w:r>
         <w:rPr>
           <w:i/>
@@ -1164,6 +1356,7 @@
         </w:rPr>
         <w:t>Seasonality</w:t>
       </w:r>
+      <w:proofErr w:type="spellEnd"/>
       <w:r>
         <w:rPr>
           <w:sz w:val="28"/>
@@ -1268,6 +1461,7 @@
       <w:r>
         <w:br/>
       </w:r>
+      <w:proofErr w:type="spellStart"/>
       <w:r>
         <w:rPr>
           <w:i/>
@@ -1275,6 +1469,7 @@
         </w:rPr>
         <w:t>Seasonalityt</w:t>
       </w:r>
+      <w:proofErr w:type="spellEnd"/>
       <w:r>
         <w:rPr>
           <w:rFonts w:ascii="Arial" w:hAnsi="Arial" w:cs="Arial"/>
@@ -1364,7 +1559,27 @@
           <w:sz w:val="32"/>
           <w:szCs w:val="32"/>
         </w:rPr>
-        <w:t>Model NegBin (jeśli dane są zbyt zmienne)</w:t>
+        <w:t xml:space="preserve">Model </w:t>
+      </w:r>
+      <w:proofErr w:type="spellStart"/>
+      <w:r>
+        <w:rPr>
+          <w:b/>
+          <w:bCs/>
+          <w:sz w:val="32"/>
+          <w:szCs w:val="32"/>
+        </w:rPr>
+        <w:t>NegBin</w:t>
+      </w:r>
+      <w:proofErr w:type="spellEnd"/>
+      <w:r>
+        <w:rPr>
+          <w:b/>
+          <w:bCs/>
+          <w:sz w:val="32"/>
+          <w:szCs w:val="32"/>
+        </w:rPr>
+        <w:t xml:space="preserve"> (jeśli dane są zbyt zmienne)</w:t>
       </w:r>
     </w:p>
     <w:p>
@@ -1376,6 +1591,7 @@
           <w:szCs w:val="32"/>
         </w:rPr>
       </w:pPr>
+      <w:proofErr w:type="spellStart"/>
       <w:r>
         <w:rPr>
           <w:sz w:val="32"/>
@@ -1391,12 +1607,29 @@
         </w:rPr>
         <w:t>t</w:t>
       </w:r>
+      <w:proofErr w:type="spellEnd"/>
       <w:r>
         <w:rPr>
           <w:sz w:val="32"/>
           <w:szCs w:val="32"/>
         </w:rPr>
-        <w:t xml:space="preserve"> ~ NegBin(µ</w:t>
+        <w:t xml:space="preserve"> ~ </w:t>
+      </w:r>
+      <w:proofErr w:type="spellStart"/>
+      <w:r>
+        <w:rPr>
+          <w:sz w:val="32"/>
+          <w:szCs w:val="32"/>
+        </w:rPr>
+        <w:t>NegBin</w:t>
+      </w:r>
+      <w:proofErr w:type="spellEnd"/>
+      <w:r>
+        <w:rPr>
+          <w:sz w:val="32"/>
+          <w:szCs w:val="32"/>
+        </w:rPr>
+        <w:t>(µ</w:t>
       </w:r>
       <w:r>
         <w:rPr>
@@ -1428,14 +1661,7 @@
           <w:sz w:val="32"/>
           <w:szCs w:val="32"/>
         </w:rPr>
-        <w:t>log(</w:t>
-      </w:r>
-      <w:r>
-        <w:rPr>
-          <w:sz w:val="32"/>
-          <w:szCs w:val="32"/>
-        </w:rPr>
-        <w:t>µ</w:t>
+        <w:t>log(µ</w:t>
       </w:r>
       <w:r>
         <w:rPr>
@@ -1450,7 +1676,15 @@
           <w:sz w:val="32"/>
           <w:szCs w:val="32"/>
         </w:rPr>
-        <w:t>) = X</w:t>
+        <w:t xml:space="preserve">) = </w:t>
+      </w:r>
+      <w:proofErr w:type="spellStart"/>
+      <w:r>
+        <w:rPr>
+          <w:sz w:val="32"/>
+          <w:szCs w:val="32"/>
+        </w:rPr>
+        <w:t>X</w:t>
       </w:r>
       <w:r>
         <w:rPr>
@@ -1467,6 +1701,7 @@
         </w:rPr>
         <w:t>ß</w:t>
       </w:r>
+      <w:proofErr w:type="spellEnd"/>
     </w:p>
     <w:p>
       <w:pPr>
@@ -1508,9 +1743,11 @@
           <w:numId w:val="5"/>
         </w:numPr>
       </w:pPr>
+      <w:proofErr w:type="spellStart"/>
       <w:r>
         <w:t>Deviance</w:t>
       </w:r>
+      <w:proofErr w:type="spellEnd"/>
     </w:p>
     <w:p>
       <w:pPr>
@@ -1557,117 +1794,135 @@
     </w:p>
     <w:p>
       <w:r>
-        <w:t>Dane pobrano z </w:t>
-      </w:r>
-      <w:r>
-        <w:rPr>
-          <w:b/>
-          <w:bCs/>
-        </w:rPr>
-        <w:t>ECDC Atlas</w:t>
-      </w:r>
-      <w:r>
-        <w:t>, obejmujące miesięczne raporty 1999–2023 dla krajów UE/EOG.</w:t>
-      </w:r>
-      <w:r>
-        <w:br/>
-        <w:t>Zakres danych:</w:t>
-      </w:r>
-    </w:p>
-    <w:p>
-      <w:pPr>
-        <w:numPr>
-          <w:ilvl w:val="0"/>
-          <w:numId w:val="6"/>
-        </w:numPr>
-      </w:pPr>
-      <w:r>
-        <w:t>liczba potwierdzonych przypadków</w:t>
-      </w:r>
-    </w:p>
-    <w:p>
-      <w:pPr>
-        <w:numPr>
-          <w:ilvl w:val="0"/>
-          <w:numId w:val="6"/>
-        </w:numPr>
-      </w:pPr>
-      <w:r>
-        <w:t>kod kraju (RegionCode)</w:t>
-      </w:r>
-    </w:p>
-    <w:p>
-      <w:pPr>
-        <w:numPr>
-          <w:ilvl w:val="0"/>
-          <w:numId w:val="6"/>
-        </w:numPr>
-      </w:pPr>
-      <w:r>
-        <w:t>jednostka raportowania</w:t>
-      </w:r>
-    </w:p>
-    <w:p>
-      <w:pPr>
-        <w:numPr>
-          <w:ilvl w:val="0"/>
-          <w:numId w:val="6"/>
-        </w:numPr>
-      </w:pPr>
-      <w:r>
-        <w:t>populacja (jeśli dostępna)</w:t>
-      </w:r>
-    </w:p>
-    <w:p>
-      <w:r>
-        <w:t>Dane oczyszczono poprzez:</w:t>
-      </w:r>
-    </w:p>
-    <w:p>
-      <w:pPr>
-        <w:numPr>
-          <w:ilvl w:val="0"/>
-          <w:numId w:val="7"/>
-        </w:numPr>
-      </w:pPr>
-      <w:r>
-        <w:t>konwersję braków „-” na NaN</w:t>
-      </w:r>
-    </w:p>
-    <w:p>
-      <w:pPr>
-        <w:numPr>
-          <w:ilvl w:val="0"/>
-          <w:numId w:val="7"/>
-        </w:numPr>
-      </w:pPr>
-      <w:r>
-        <w:t>normalizację dat</w:t>
-      </w:r>
-    </w:p>
-    <w:p>
-      <w:pPr>
-        <w:numPr>
-          <w:ilvl w:val="0"/>
-          <w:numId w:val="7"/>
-        </w:numPr>
-      </w:pPr>
-      <w:r>
-        <w:t>usunięcie błędnych rekordów</w:t>
-      </w:r>
-    </w:p>
-    <w:p>
-      <w:pPr>
-        <w:numPr>
-          <w:ilvl w:val="0"/>
-          <w:numId w:val="7"/>
-        </w:numPr>
-      </w:pPr>
-      <w:r>
-        <w:t>agregację do poziomu miesięcznego</w:t>
+        <w:t xml:space="preserve">Dane zostały pobrane z zasobów </w:t>
+      </w:r>
+      <w:proofErr w:type="spellStart"/>
+      <w:r>
+        <w:t>European</w:t>
+      </w:r>
+      <w:proofErr w:type="spellEnd"/>
+      <w:r>
+        <w:t xml:space="preserve"> Centre for </w:t>
+      </w:r>
+      <w:proofErr w:type="spellStart"/>
+      <w:r>
+        <w:t>Disease</w:t>
+      </w:r>
+      <w:proofErr w:type="spellEnd"/>
+      <w:r>
+        <w:t xml:space="preserve"> </w:t>
+      </w:r>
+      <w:proofErr w:type="spellStart"/>
+      <w:r>
+        <w:t>Prevention</w:t>
+      </w:r>
+      <w:proofErr w:type="spellEnd"/>
+      <w:r>
+        <w:t xml:space="preserve"> and Control (ECDC) i obejmują roczne raporty </w:t>
+      </w:r>
+      <w:proofErr w:type="spellStart"/>
+      <w:r>
+        <w:t>zachorowań</w:t>
+      </w:r>
+      <w:proofErr w:type="spellEnd"/>
+      <w:r>
+        <w:t xml:space="preserve"> dla krajów Unii Europejskiej oraz Europejskiego Obszaru Gospodarczego z lat 1999–2023.</w:t>
       </w:r>
     </w:p>
     <w:p/>
+    <w:p>
+      <w:r>
+        <w:t>Zakres danych obejmuje:</w:t>
+      </w:r>
+    </w:p>
+    <w:p>
+      <w:r>
+        <w:t xml:space="preserve">- liczbę zgłoszonych przypadków </w:t>
+      </w:r>
+      <w:proofErr w:type="spellStart"/>
+      <w:r>
+        <w:t>zachorowań</w:t>
+      </w:r>
+      <w:proofErr w:type="spellEnd"/>
+      <w:r>
+        <w:t>,</w:t>
+      </w:r>
+    </w:p>
+    <w:p>
+      <w:r>
+        <w:t>- kraj raportujący (Country),</w:t>
+      </w:r>
+    </w:p>
+    <w:p>
+      <w:r>
+        <w:t>- rok obserwacji,</w:t>
+      </w:r>
+    </w:p>
+    <w:p>
+      <w:r>
+        <w:t>- populację,</w:t>
+      </w:r>
+    </w:p>
+    <w:p>
+      <w:r>
+        <w:t>- wskaźnik zachorowalności (</w:t>
+      </w:r>
+      <w:proofErr w:type="spellStart"/>
+      <w:r>
+        <w:t>Incidence</w:t>
+      </w:r>
+      <w:proofErr w:type="spellEnd"/>
+      <w:r>
+        <w:t>),</w:t>
+      </w:r>
+    </w:p>
+    <w:p>
+      <w:r>
+        <w:t xml:space="preserve">- poziom </w:t>
+      </w:r>
+      <w:proofErr w:type="spellStart"/>
+      <w:r>
+        <w:t>wyszczepialności</w:t>
+      </w:r>
+      <w:proofErr w:type="spellEnd"/>
+      <w:r>
+        <w:t xml:space="preserve"> populacji,</w:t>
+      </w:r>
+    </w:p>
+    <w:p>
+      <w:r>
+        <w:t>- wybrane zmienne demograficzne (udział populacji w wieku 0–14 lat).</w:t>
+      </w:r>
+    </w:p>
+    <w:p/>
+    <w:p>
+      <w:r>
+        <w:t>Dane zostały wstępnie oczyszczone poprzez:</w:t>
+      </w:r>
+    </w:p>
+    <w:p>
+      <w:r>
+        <w:t xml:space="preserve">- identyfikację i oznaczenie brakujących wartości jako </w:t>
+      </w:r>
+      <w:proofErr w:type="spellStart"/>
+      <w:r>
+        <w:t>NaN</w:t>
+      </w:r>
+      <w:proofErr w:type="spellEnd"/>
+      <w:r>
+        <w:t>,</w:t>
+      </w:r>
+    </w:p>
+    <w:p>
+      <w:r>
+        <w:t>- weryfikację spójności typów danych,</w:t>
+      </w:r>
+    </w:p>
+    <w:p>
+      <w:r>
+        <w:t>- usunięcie obserwacji niekompletnych wyłącznie w analizach wymagających pełnych danych,</w:t>
+      </w:r>
+    </w:p>
     <w:p>
       <w:pPr>
         <w:rPr>
@@ -1678,15 +1933,246 @@
         </w:rPr>
       </w:pPr>
       <w:r>
+        <w:lastRenderedPageBreak/>
+        <w:t>- standaryzację zmiennych liczbowych do dalszej analizy.</w:t>
+      </w:r>
+      <w:r>
         <w:rPr>
           <w:b/>
           <w:bCs/>
           <w:sz w:val="52"/>
           <w:szCs w:val="52"/>
         </w:rPr>
-        <w:t>Dyskusja</w:t>
-      </w:r>
-    </w:p>
+        <w:t xml:space="preserve"> </w:t>
+      </w:r>
+    </w:p>
+    <w:p>
+      <w:pPr>
+        <w:rPr>
+          <w:b/>
+          <w:bCs/>
+        </w:rPr>
+      </w:pPr>
+      <w:r>
+        <w:rPr>
+          <w:b/>
+          <w:bCs/>
+        </w:rPr>
+        <w:t>Analiza wstępna</w:t>
+      </w:r>
+    </w:p>
+    <w:p>
+      <w:r>
+        <w:t>W ramach analizy wstępnej przeprowadzono eksploracyjną analizę danych (EDA), której celem było rozpoznanie struktury danych oraz identyfikacja kluczowych wzorców epidemiologicznych.</w:t>
+      </w:r>
+    </w:p>
+    <w:p>
+      <w:r>
+        <w:t>Wykonano:</w:t>
+      </w:r>
+    </w:p>
+    <w:p>
+      <w:r>
+        <w:t>- analizę statystyk opisowych,</w:t>
+      </w:r>
+    </w:p>
+    <w:p>
+      <w:r>
+        <w:t>- wykresy trendów czasowych zachorowalności dla poszczególnych krajów,</w:t>
+      </w:r>
+    </w:p>
+    <w:p>
+      <w:r>
+        <w:t>- porównania między krajami przy użyciu wykresów pudełkowych oraz map cieplnych,</w:t>
+      </w:r>
+    </w:p>
+    <w:p>
+      <w:r>
+        <w:t>- analizę rozkładu zmiennej zachorowalności wraz z identyfikacją wartości odstających,</w:t>
+      </w:r>
+    </w:p>
+    <w:p>
+      <w:r>
+        <w:t xml:space="preserve">- ocenę zależności pomiędzy zachorowalnością a poziomem </w:t>
+      </w:r>
+      <w:proofErr w:type="spellStart"/>
+      <w:r>
+        <w:t>wyszczepialności</w:t>
+      </w:r>
+      <w:proofErr w:type="spellEnd"/>
+      <w:r>
+        <w:t xml:space="preserve"> oraz zmiennymi demograficznymi.</w:t>
+      </w:r>
+    </w:p>
+    <w:p>
+      <w:r>
+        <w:t>Analiza wykazała:</w:t>
+      </w:r>
+    </w:p>
+    <w:p>
+      <w:r>
+        <w:t>- silnie prawostronnie skośny rozkład zachorowalności, z dominacją niskich wartości oraz nielicznymi epizodami epidemicznymi,</w:t>
+      </w:r>
+    </w:p>
+    <w:p>
+      <w:r>
+        <w:t xml:space="preserve">- występowanie istotnych różnic pomiędzy krajami zarówno pod względem poziomu </w:t>
+      </w:r>
+      <w:proofErr w:type="spellStart"/>
+      <w:r>
+        <w:t>zachorowań</w:t>
+      </w:r>
+      <w:proofErr w:type="spellEnd"/>
+      <w:r>
+        <w:t>, jak i zmienności w czasie,</w:t>
+      </w:r>
+    </w:p>
+    <w:p>
+      <w:r>
+        <w:t>- brak możliwości klasycznej analizy sezonowości miesięcznej ze względu na roczny charakter danych,</w:t>
+      </w:r>
+    </w:p>
+    <w:p>
+      <w:r>
+        <w:t xml:space="preserve">- ujemną zależność pomiędzy poziomem </w:t>
+      </w:r>
+      <w:proofErr w:type="spellStart"/>
+      <w:r>
+        <w:t>wyszczepialności</w:t>
+      </w:r>
+      <w:proofErr w:type="spellEnd"/>
+      <w:r>
+        <w:t xml:space="preserve"> a zachorowalnością,</w:t>
+      </w:r>
+    </w:p>
+    <w:p>
+      <w:r>
+        <w:t xml:space="preserve">- ogólną stabilizację lub spadek </w:t>
+      </w:r>
+      <w:proofErr w:type="spellStart"/>
+      <w:r>
+        <w:t>zachorowań</w:t>
+      </w:r>
+      <w:proofErr w:type="spellEnd"/>
+      <w:r>
+        <w:t xml:space="preserve"> w długim okresie, z okresowymi lokalnymi wzrostami.</w:t>
+      </w:r>
+    </w:p>
+    <w:p>
+      <w:pPr>
+        <w:rPr>
+          <w:b/>
+          <w:bCs/>
+        </w:rPr>
+      </w:pPr>
+      <w:r>
+        <w:rPr>
+          <w:b/>
+          <w:bCs/>
+        </w:rPr>
+        <w:t>Przygotowanie do modelowania</w:t>
+      </w:r>
+    </w:p>
+    <w:p>
+      <w:r>
+        <w:t>Na podstawie przeprowadzonej eksploracyjnej analizy danych określono kluczowe cechy, które powinny zostać uwzględnione w dalszym etapie modelowania predykcyjnego.</w:t>
+      </w:r>
+    </w:p>
+    <w:p>
+      <w:r>
+        <w:t>Zidentyfikowano:</w:t>
+      </w:r>
+    </w:p>
+    <w:p>
+      <w:r>
+        <w:t>- nadmierną wariancję zmiennej liczby przypadków,</w:t>
+      </w:r>
+    </w:p>
+    <w:p>
+      <w:r>
+        <w:t>- obecność wartości ekstremalnych odpowiadających epizodom epidemicznym,</w:t>
+      </w:r>
+    </w:p>
+    <w:p>
+      <w:r>
+        <w:t xml:space="preserve">- istotny wpływ czasu oraz poziomu </w:t>
+      </w:r>
+      <w:proofErr w:type="spellStart"/>
+      <w:r>
+        <w:t>wyszczepialności</w:t>
+      </w:r>
+      <w:proofErr w:type="spellEnd"/>
+      <w:r>
+        <w:t xml:space="preserve"> na zachorowalność.</w:t>
+      </w:r>
+    </w:p>
+    <w:p/>
+    <w:p>
+      <w:r>
+        <w:lastRenderedPageBreak/>
+        <w:t xml:space="preserve">Analiza EDA stanowiła etap przygotowawczy do zastosowania modeli statystycznych dla danych </w:t>
+      </w:r>
+      <w:proofErr w:type="spellStart"/>
+      <w:r>
+        <w:t>zliczeniowych</w:t>
+      </w:r>
+      <w:proofErr w:type="spellEnd"/>
+      <w:r>
+        <w:t xml:space="preserve">, takich jak modele Poissona lub </w:t>
+      </w:r>
+      <w:proofErr w:type="spellStart"/>
+      <w:r>
+        <w:t>Negative</w:t>
+      </w:r>
+      <w:proofErr w:type="spellEnd"/>
+      <w:r>
+        <w:t xml:space="preserve"> </w:t>
+      </w:r>
+      <w:proofErr w:type="spellStart"/>
+      <w:r>
+        <w:t>Binomial</w:t>
+      </w:r>
+      <w:proofErr w:type="spellEnd"/>
+      <w:r>
+        <w:t>, które mogą zostać wykorzystane w kolejnych etapach pracy.</w:t>
+      </w:r>
+    </w:p>
+    <w:p/>
+    <w:p>
+      <w:pPr>
+        <w:jc w:val="center"/>
+        <w:rPr>
+          <w:b/>
+          <w:bCs/>
+          <w:color w:val="EE0000"/>
+          <w:sz w:val="44"/>
+          <w:szCs w:val="44"/>
+        </w:rPr>
+      </w:pPr>
+      <w:r>
+        <w:rPr>
+          <w:b/>
+          <w:bCs/>
+          <w:color w:val="EE0000"/>
+          <w:sz w:val="44"/>
+          <w:szCs w:val="44"/>
+        </w:rPr>
+        <w:t xml:space="preserve">Model predykcji trzeba </w:t>
+      </w:r>
+      <w:proofErr w:type="spellStart"/>
+      <w:r>
+        <w:rPr>
+          <w:b/>
+          <w:bCs/>
+          <w:color w:val="EE0000"/>
+          <w:sz w:val="44"/>
+          <w:szCs w:val="44"/>
+        </w:rPr>
+        <w:t>opisac</w:t>
+      </w:r>
+      <w:proofErr w:type="spellEnd"/>
+    </w:p>
+    <w:p/>
     <w:p>
       <w:pPr>
         <w:rPr>
@@ -1703,7 +2189,40 @@
           <w:sz w:val="52"/>
           <w:szCs w:val="52"/>
         </w:rPr>
-        <w:t>Wnioski</w:t>
+        <w:t>Dyskusja</w:t>
+      </w:r>
+    </w:p>
+    <w:p>
+      <w:r>
+        <w:t xml:space="preserve">Przeprowadzona eksploracyjna analiza danych pozwoliła na identyfikację kluczowych wzorców epidemiologicznych dotyczących </w:t>
+      </w:r>
+      <w:proofErr w:type="spellStart"/>
+      <w:r>
+        <w:t>zachorowań</w:t>
+      </w:r>
+      <w:proofErr w:type="spellEnd"/>
+      <w:r>
+        <w:t xml:space="preserve"> w krajach UE/EOG. Zaobserwowane trendy spadkowe w długim okresie są zgodne z doniesieniami literaturowymi wskazującymi na skuteczność programów szczepień ochronnych.</w:t>
+      </w:r>
+    </w:p>
+    <w:p/>
+    <w:p>
+      <w:r>
+        <w:t xml:space="preserve">Jednocześnie obecność pojedynczych lat o bardzo wysokiej zachorowalności wskazuje na występowanie epizodów epidemicznych, które mogą być związane z lokalnymi spadkami </w:t>
+      </w:r>
+      <w:proofErr w:type="spellStart"/>
+      <w:r>
+        <w:t>wyszczepialności</w:t>
+      </w:r>
+      <w:proofErr w:type="spellEnd"/>
+      <w:r>
+        <w:t>, opóźnieniami w raportowaniu lub czynnikami demograficznymi. Zróżnicowanie pomiędzy krajami podkreśla znaczenie lokalnych polityk zdrowotnych oraz jakości systemów nadzoru epidemiologicznego.</w:t>
+      </w:r>
+    </w:p>
+    <w:p/>
+    <w:p>
+      <w:r>
+        <w:t>Należy podkreślić, że analiza opiera się na danych rocznych, co uniemożliwia ocenę sezonowości miesięcznej oraz ogranicza możliwości precyzyjnego modelowania czasowego. Ponadto brakujące dane w niektórych latach mogą wpływać na dokładność oszacowań.</w:t>
       </w:r>
     </w:p>
     <w:p>
@@ -1722,7 +2241,694 @@
           <w:sz w:val="52"/>
           <w:szCs w:val="52"/>
         </w:rPr>
+        <w:t>Wnioski</w:t>
+      </w:r>
+    </w:p>
+    <w:p>
+      <w:r>
+        <w:t>Na podstawie przeprowadzonej analizy można sformułować następujące wnioski:</w:t>
+      </w:r>
+    </w:p>
+    <w:p>
+      <w:r>
+        <w:t>1. Zachorowalność w krajach UE/EOG charakteryzuje się silnie skośnym rozkładem, z dominacją niskich wartości oraz rzadkimi epizodami epidemicznymi.</w:t>
+      </w:r>
+    </w:p>
+    <w:p>
+      <w:r>
+        <w:t xml:space="preserve">2. W długim okresie obserwuje się stabilizację lub spadek liczby </w:t>
+      </w:r>
+      <w:proofErr w:type="spellStart"/>
+      <w:r>
+        <w:t>zachorowań</w:t>
+      </w:r>
+      <w:proofErr w:type="spellEnd"/>
+      <w:r>
+        <w:t>, choć występują lokalne i czasowe wzrosty.</w:t>
+      </w:r>
+    </w:p>
+    <w:p>
+      <w:r>
+        <w:t xml:space="preserve">3. Istnieją istotne różnice pomiędzy krajami pod względem poziomu i zmienności </w:t>
+      </w:r>
+      <w:proofErr w:type="spellStart"/>
+      <w:r>
+        <w:t>zachorowań</w:t>
+      </w:r>
+      <w:proofErr w:type="spellEnd"/>
+      <w:r>
+        <w:t>.</w:t>
+      </w:r>
+    </w:p>
+    <w:p>
+      <w:r>
+        <w:lastRenderedPageBreak/>
+        <w:t xml:space="preserve">4. Poziom </w:t>
+      </w:r>
+      <w:proofErr w:type="spellStart"/>
+      <w:r>
+        <w:t>wyszczepialności</w:t>
+      </w:r>
+      <w:proofErr w:type="spellEnd"/>
+      <w:r>
+        <w:t xml:space="preserve"> wykazuje ujemną zależność z zachorowalnością, co potwierdza jego kluczową rolę w zapobieganiu epidemiom.</w:t>
+      </w:r>
+    </w:p>
+    <w:p>
+      <w:r>
+        <w:t>5. Przeprowadzona eksploracyjna analiza danych stanowi solidną podstawę do dalszego modelowania predykcyjnego w przyszłych etapach badań.</w:t>
+      </w:r>
+    </w:p>
+    <w:p>
+      <w:pPr>
+        <w:rPr>
+          <w:b/>
+          <w:bCs/>
+          <w:sz w:val="52"/>
+          <w:szCs w:val="52"/>
+        </w:rPr>
+      </w:pPr>
+      <w:r>
+        <w:rPr>
+          <w:b/>
+          <w:bCs/>
+          <w:sz w:val="52"/>
+          <w:szCs w:val="52"/>
+        </w:rPr>
         <w:t>Źródła</w:t>
+      </w:r>
+    </w:p>
+    <w:p>
+      <w:pPr>
+        <w:numPr>
+          <w:ilvl w:val="0"/>
+          <w:numId w:val="10"/>
+        </w:numPr>
+      </w:pPr>
+      <w:proofErr w:type="spellStart"/>
+      <w:r>
+        <w:t>European</w:t>
+      </w:r>
+      <w:proofErr w:type="spellEnd"/>
+      <w:r>
+        <w:t xml:space="preserve"> Centre for </w:t>
+      </w:r>
+      <w:proofErr w:type="spellStart"/>
+      <w:r>
+        <w:t>Disease</w:t>
+      </w:r>
+      <w:proofErr w:type="spellEnd"/>
+      <w:r>
+        <w:t xml:space="preserve"> </w:t>
+      </w:r>
+      <w:proofErr w:type="spellStart"/>
+      <w:r>
+        <w:t>Prevention</w:t>
+      </w:r>
+      <w:proofErr w:type="spellEnd"/>
+      <w:r>
+        <w:t xml:space="preserve"> and Control. </w:t>
+      </w:r>
+      <w:proofErr w:type="spellStart"/>
+      <w:r>
+        <w:rPr>
+          <w:b/>
+          <w:bCs/>
+        </w:rPr>
+        <w:t>Surveillance</w:t>
+      </w:r>
+      <w:proofErr w:type="spellEnd"/>
+      <w:r>
+        <w:rPr>
+          <w:b/>
+          <w:bCs/>
+        </w:rPr>
+        <w:t xml:space="preserve"> Atlas of </w:t>
+      </w:r>
+      <w:proofErr w:type="spellStart"/>
+      <w:r>
+        <w:rPr>
+          <w:b/>
+          <w:bCs/>
+        </w:rPr>
+        <w:t>Infectious</w:t>
+      </w:r>
+      <w:proofErr w:type="spellEnd"/>
+      <w:r>
+        <w:rPr>
+          <w:b/>
+          <w:bCs/>
+        </w:rPr>
+        <w:t xml:space="preserve"> </w:t>
+      </w:r>
+      <w:proofErr w:type="spellStart"/>
+      <w:r>
+        <w:rPr>
+          <w:b/>
+          <w:bCs/>
+        </w:rPr>
+        <w:t>Diseases</w:t>
+      </w:r>
+      <w:proofErr w:type="spellEnd"/>
+      <w:r>
+        <w:t>. ECDC, 2023.</w:t>
+      </w:r>
+    </w:p>
+    <w:p>
+      <w:pPr>
+        <w:numPr>
+          <w:ilvl w:val="0"/>
+          <w:numId w:val="10"/>
+        </w:numPr>
+      </w:pPr>
+      <w:r>
+        <w:t>WHO. </w:t>
+      </w:r>
+      <w:proofErr w:type="spellStart"/>
+      <w:r>
+        <w:rPr>
+          <w:b/>
+          <w:bCs/>
+        </w:rPr>
+        <w:t>Measles</w:t>
+      </w:r>
+      <w:proofErr w:type="spellEnd"/>
+      <w:r>
+        <w:rPr>
+          <w:b/>
+          <w:bCs/>
+        </w:rPr>
+        <w:t xml:space="preserve"> and </w:t>
+      </w:r>
+      <w:proofErr w:type="spellStart"/>
+      <w:r>
+        <w:rPr>
+          <w:b/>
+          <w:bCs/>
+        </w:rPr>
+        <w:t>Rubella</w:t>
+      </w:r>
+      <w:proofErr w:type="spellEnd"/>
+      <w:r>
+        <w:rPr>
+          <w:b/>
+          <w:bCs/>
+        </w:rPr>
+        <w:t xml:space="preserve"> </w:t>
+      </w:r>
+      <w:proofErr w:type="spellStart"/>
+      <w:r>
+        <w:rPr>
+          <w:b/>
+          <w:bCs/>
+        </w:rPr>
+        <w:t>Surveillance</w:t>
+      </w:r>
+      <w:proofErr w:type="spellEnd"/>
+      <w:r>
+        <w:rPr>
+          <w:b/>
+          <w:bCs/>
+        </w:rPr>
+        <w:t xml:space="preserve"> Data</w:t>
+      </w:r>
+      <w:r>
+        <w:t>, WHO Europe 2022–2024.</w:t>
+      </w:r>
+    </w:p>
+    <w:p>
+      <w:pPr>
+        <w:numPr>
+          <w:ilvl w:val="0"/>
+          <w:numId w:val="10"/>
+        </w:numPr>
+      </w:pPr>
+      <w:r>
+        <w:t>Funk S., et al. </w:t>
+      </w:r>
+      <w:proofErr w:type="spellStart"/>
+      <w:r>
+        <w:rPr>
+          <w:i/>
+          <w:iCs/>
+        </w:rPr>
+        <w:t>Quantifying</w:t>
+      </w:r>
+      <w:proofErr w:type="spellEnd"/>
+      <w:r>
+        <w:rPr>
+          <w:i/>
+          <w:iCs/>
+        </w:rPr>
+        <w:t xml:space="preserve"> </w:t>
+      </w:r>
+      <w:proofErr w:type="spellStart"/>
+      <w:r>
+        <w:rPr>
+          <w:i/>
+          <w:iCs/>
+        </w:rPr>
+        <w:t>infectious</w:t>
+      </w:r>
+      <w:proofErr w:type="spellEnd"/>
+      <w:r>
+        <w:rPr>
+          <w:i/>
+          <w:iCs/>
+        </w:rPr>
+        <w:t xml:space="preserve"> </w:t>
+      </w:r>
+      <w:proofErr w:type="spellStart"/>
+      <w:r>
+        <w:rPr>
+          <w:i/>
+          <w:iCs/>
+        </w:rPr>
+        <w:t>disease</w:t>
+      </w:r>
+      <w:proofErr w:type="spellEnd"/>
+      <w:r>
+        <w:rPr>
+          <w:i/>
+          <w:iCs/>
+        </w:rPr>
+        <w:t xml:space="preserve"> </w:t>
+      </w:r>
+      <w:proofErr w:type="spellStart"/>
+      <w:r>
+        <w:rPr>
+          <w:i/>
+          <w:iCs/>
+        </w:rPr>
+        <w:t>transmission</w:t>
+      </w:r>
+      <w:proofErr w:type="spellEnd"/>
+      <w:r>
+        <w:rPr>
+          <w:i/>
+          <w:iCs/>
+        </w:rPr>
+        <w:t xml:space="preserve"> with </w:t>
+      </w:r>
+      <w:proofErr w:type="spellStart"/>
+      <w:r>
+        <w:rPr>
+          <w:i/>
+          <w:iCs/>
+        </w:rPr>
+        <w:t>count</w:t>
+      </w:r>
+      <w:r>
+        <w:rPr>
+          <w:i/>
+          <w:iCs/>
+        </w:rPr>
+        <w:noBreakHyphen/>
+        <w:t>based</w:t>
+      </w:r>
+      <w:proofErr w:type="spellEnd"/>
+      <w:r>
+        <w:rPr>
+          <w:i/>
+          <w:iCs/>
+        </w:rPr>
+        <w:t xml:space="preserve"> </w:t>
+      </w:r>
+      <w:proofErr w:type="spellStart"/>
+      <w:r>
+        <w:rPr>
+          <w:i/>
+          <w:iCs/>
+        </w:rPr>
+        <w:t>regression</w:t>
+      </w:r>
+      <w:proofErr w:type="spellEnd"/>
+      <w:r>
+        <w:rPr>
+          <w:i/>
+          <w:iCs/>
+        </w:rPr>
+        <w:t xml:space="preserve"> </w:t>
+      </w:r>
+      <w:proofErr w:type="spellStart"/>
+      <w:r>
+        <w:rPr>
+          <w:i/>
+          <w:iCs/>
+        </w:rPr>
+        <w:t>models</w:t>
+      </w:r>
+      <w:proofErr w:type="spellEnd"/>
+      <w:r>
+        <w:rPr>
+          <w:i/>
+          <w:iCs/>
+        </w:rPr>
+        <w:t>.</w:t>
+      </w:r>
+      <w:r>
+        <w:t> </w:t>
+      </w:r>
+      <w:proofErr w:type="spellStart"/>
+      <w:r>
+        <w:t>Journal</w:t>
+      </w:r>
+      <w:proofErr w:type="spellEnd"/>
+      <w:r>
+        <w:t xml:space="preserve"> of </w:t>
+      </w:r>
+      <w:proofErr w:type="spellStart"/>
+      <w:r>
+        <w:t>Infectious</w:t>
+      </w:r>
+      <w:proofErr w:type="spellEnd"/>
+      <w:r>
+        <w:t xml:space="preserve"> </w:t>
+      </w:r>
+      <w:proofErr w:type="spellStart"/>
+      <w:r>
+        <w:t>Disease</w:t>
+      </w:r>
+      <w:proofErr w:type="spellEnd"/>
+      <w:r>
+        <w:t xml:space="preserve"> Modeling, 2021.</w:t>
+      </w:r>
+    </w:p>
+    <w:p>
+      <w:pPr>
+        <w:numPr>
+          <w:ilvl w:val="0"/>
+          <w:numId w:val="10"/>
+        </w:numPr>
+      </w:pPr>
+      <w:proofErr w:type="spellStart"/>
+      <w:r>
+        <w:t>Moss</w:t>
+      </w:r>
+      <w:proofErr w:type="spellEnd"/>
+      <w:r>
+        <w:t xml:space="preserve"> W. </w:t>
+      </w:r>
+      <w:proofErr w:type="spellStart"/>
+      <w:r>
+        <w:rPr>
+          <w:b/>
+          <w:bCs/>
+        </w:rPr>
+        <w:t>Measles</w:t>
+      </w:r>
+      <w:proofErr w:type="spellEnd"/>
+      <w:r>
+        <w:rPr>
+          <w:b/>
+          <w:bCs/>
+        </w:rPr>
+        <w:t xml:space="preserve"> </w:t>
+      </w:r>
+      <w:proofErr w:type="spellStart"/>
+      <w:r>
+        <w:rPr>
+          <w:b/>
+          <w:bCs/>
+        </w:rPr>
+        <w:t>control</w:t>
+      </w:r>
+      <w:proofErr w:type="spellEnd"/>
+      <w:r>
+        <w:rPr>
+          <w:b/>
+          <w:bCs/>
+        </w:rPr>
+        <w:t xml:space="preserve"> and </w:t>
+      </w:r>
+      <w:proofErr w:type="spellStart"/>
+      <w:r>
+        <w:rPr>
+          <w:b/>
+          <w:bCs/>
+        </w:rPr>
+        <w:t>elimination</w:t>
+      </w:r>
+      <w:proofErr w:type="spellEnd"/>
+      <w:r>
+        <w:rPr>
+          <w:b/>
+          <w:bCs/>
+        </w:rPr>
+        <w:t xml:space="preserve"> in Europe</w:t>
+      </w:r>
+      <w:r>
+        <w:t xml:space="preserve">. Lancet </w:t>
+      </w:r>
+      <w:proofErr w:type="spellStart"/>
+      <w:r>
+        <w:t>Infectious</w:t>
+      </w:r>
+      <w:proofErr w:type="spellEnd"/>
+      <w:r>
+        <w:t xml:space="preserve"> </w:t>
+      </w:r>
+      <w:proofErr w:type="spellStart"/>
+      <w:r>
+        <w:t>Diseases</w:t>
+      </w:r>
+      <w:proofErr w:type="spellEnd"/>
+      <w:r>
+        <w:t>, 2020.</w:t>
+      </w:r>
+    </w:p>
+    <w:p>
+      <w:pPr>
+        <w:numPr>
+          <w:ilvl w:val="0"/>
+          <w:numId w:val="10"/>
+        </w:numPr>
+      </w:pPr>
+      <w:proofErr w:type="spellStart"/>
+      <w:r>
+        <w:t>Patel</w:t>
+      </w:r>
+      <w:proofErr w:type="spellEnd"/>
+      <w:r>
+        <w:t xml:space="preserve"> M., et al. </w:t>
+      </w:r>
+      <w:proofErr w:type="spellStart"/>
+      <w:r>
+        <w:rPr>
+          <w:i/>
+          <w:iCs/>
+        </w:rPr>
+        <w:t>Impact</w:t>
+      </w:r>
+      <w:proofErr w:type="spellEnd"/>
+      <w:r>
+        <w:rPr>
+          <w:i/>
+          <w:iCs/>
+        </w:rPr>
+        <w:t xml:space="preserve"> of </w:t>
+      </w:r>
+      <w:proofErr w:type="spellStart"/>
+      <w:r>
+        <w:rPr>
+          <w:i/>
+          <w:iCs/>
+        </w:rPr>
+        <w:t>vaccination</w:t>
+      </w:r>
+      <w:proofErr w:type="spellEnd"/>
+      <w:r>
+        <w:rPr>
+          <w:i/>
+          <w:iCs/>
+        </w:rPr>
+        <w:t xml:space="preserve"> </w:t>
+      </w:r>
+      <w:proofErr w:type="spellStart"/>
+      <w:r>
+        <w:rPr>
+          <w:i/>
+          <w:iCs/>
+        </w:rPr>
+        <w:t>rates</w:t>
+      </w:r>
+      <w:proofErr w:type="spellEnd"/>
+      <w:r>
+        <w:rPr>
+          <w:i/>
+          <w:iCs/>
+        </w:rPr>
+        <w:t xml:space="preserve"> on </w:t>
+      </w:r>
+      <w:proofErr w:type="spellStart"/>
+      <w:r>
+        <w:rPr>
+          <w:i/>
+          <w:iCs/>
+        </w:rPr>
+        <w:t>measles</w:t>
+      </w:r>
+      <w:proofErr w:type="spellEnd"/>
+      <w:r>
+        <w:rPr>
+          <w:i/>
+          <w:iCs/>
+        </w:rPr>
+        <w:t xml:space="preserve"> </w:t>
+      </w:r>
+      <w:proofErr w:type="spellStart"/>
+      <w:r>
+        <w:rPr>
+          <w:i/>
+          <w:iCs/>
+        </w:rPr>
+        <w:t>outbreaks</w:t>
+      </w:r>
+      <w:proofErr w:type="spellEnd"/>
+      <w:r>
+        <w:rPr>
+          <w:i/>
+          <w:iCs/>
+        </w:rPr>
+        <w:t xml:space="preserve"> in Europe</w:t>
+      </w:r>
+      <w:r>
+        <w:t xml:space="preserve">. </w:t>
+      </w:r>
+      <w:proofErr w:type="spellStart"/>
+      <w:r>
+        <w:t>Vaccine</w:t>
+      </w:r>
+      <w:proofErr w:type="spellEnd"/>
+      <w:r>
+        <w:t>, 2023.</w:t>
+      </w:r>
+    </w:p>
+    <w:p>
+      <w:pPr>
+        <w:numPr>
+          <w:ilvl w:val="0"/>
+          <w:numId w:val="10"/>
+        </w:numPr>
+      </w:pPr>
+      <w:r>
+        <w:t>Li X., et al. </w:t>
+      </w:r>
+      <w:proofErr w:type="spellStart"/>
+      <w:r>
+        <w:rPr>
+          <w:i/>
+          <w:iCs/>
+        </w:rPr>
+        <w:t>Spatiotemporal</w:t>
+      </w:r>
+      <w:proofErr w:type="spellEnd"/>
+      <w:r>
+        <w:rPr>
+          <w:i/>
+          <w:iCs/>
+        </w:rPr>
+        <w:t xml:space="preserve"> modeling of </w:t>
+      </w:r>
+      <w:proofErr w:type="spellStart"/>
+      <w:r>
+        <w:rPr>
+          <w:i/>
+          <w:iCs/>
+        </w:rPr>
+        <w:t>measles</w:t>
+      </w:r>
+      <w:proofErr w:type="spellEnd"/>
+      <w:r>
+        <w:rPr>
+          <w:i/>
+          <w:iCs/>
+        </w:rPr>
+        <w:t xml:space="preserve"> </w:t>
+      </w:r>
+      <w:proofErr w:type="spellStart"/>
+      <w:r>
+        <w:rPr>
+          <w:i/>
+          <w:iCs/>
+        </w:rPr>
+        <w:t>transmission</w:t>
+      </w:r>
+      <w:proofErr w:type="spellEnd"/>
+      <w:r>
+        <w:rPr>
+          <w:i/>
+          <w:iCs/>
+        </w:rPr>
+        <w:t xml:space="preserve"> </w:t>
+      </w:r>
+      <w:proofErr w:type="spellStart"/>
+      <w:r>
+        <w:rPr>
+          <w:i/>
+          <w:iCs/>
+        </w:rPr>
+        <w:t>using</w:t>
+      </w:r>
+      <w:proofErr w:type="spellEnd"/>
+      <w:r>
+        <w:rPr>
+          <w:i/>
+          <w:iCs/>
+        </w:rPr>
+        <w:t xml:space="preserve"> </w:t>
+      </w:r>
+      <w:proofErr w:type="spellStart"/>
+      <w:r>
+        <w:rPr>
+          <w:i/>
+          <w:iCs/>
+        </w:rPr>
+        <w:t>negative</w:t>
+      </w:r>
+      <w:proofErr w:type="spellEnd"/>
+      <w:r>
+        <w:rPr>
+          <w:i/>
+          <w:iCs/>
+        </w:rPr>
+        <w:t xml:space="preserve"> </w:t>
+      </w:r>
+      <w:proofErr w:type="spellStart"/>
+      <w:r>
+        <w:rPr>
+          <w:i/>
+          <w:iCs/>
+        </w:rPr>
+        <w:t>binomial</w:t>
+      </w:r>
+      <w:proofErr w:type="spellEnd"/>
+      <w:r>
+        <w:rPr>
+          <w:i/>
+          <w:iCs/>
+        </w:rPr>
+        <w:t xml:space="preserve"> </w:t>
+      </w:r>
+      <w:proofErr w:type="spellStart"/>
+      <w:r>
+        <w:rPr>
+          <w:i/>
+          <w:iCs/>
+        </w:rPr>
+        <w:t>regression</w:t>
+      </w:r>
+      <w:proofErr w:type="spellEnd"/>
+      <w:r>
+        <w:t xml:space="preserve">. </w:t>
+      </w:r>
+      <w:proofErr w:type="spellStart"/>
+      <w:r>
+        <w:t>Epidemics</w:t>
+      </w:r>
+      <w:proofErr w:type="spellEnd"/>
+      <w:r>
+        <w:t>, 2022.</w:t>
       </w:r>
     </w:p>
     <w:p/>
@@ -1739,6 +2945,119 @@
 <file path=word/numbering.xml><?xml version="1.0" encoding="utf-8"?>
 <w:numbering xmlns:wpc="http://schemas.microsoft.com/office/word/2010/wordprocessingCanvas" xmlns:cx="http://schemas.microsoft.com/office/drawing/2014/chartex" xmlns:cx1="http://schemas.microsoft.com/office/drawing/2015/9/8/chartex" xmlns:cx2="http://schemas.microsoft.com/office/drawing/2015/10/21/chartex" xmlns:cx3="http://schemas.microsoft.com/office/drawing/2016/5/9/chartex" xmlns:cx4="http://schemas.microsoft.com/office/drawing/2016/5/10/chartex" xmlns:cx5="http://schemas.microsoft.com/office/drawing/2016/5/11/chartex" xmlns:cx6="http://schemas.microsoft.com/office/drawing/2016/5/12/chartex" xmlns:cx7="http://schemas.microsoft.com/office/drawing/2016/5/13/chartex" xmlns:cx8="http://schemas.microsoft.com/office/drawing/2016/5/14/chartex" xmlns:mc="http://schemas.openxmlformats.org/markup-compatibility/2006" xmlns:aink="http://schemas.microsoft.com/office/drawing/2016/ink" xmlns:am3d="http://schemas.microsoft.com/office/drawing/2017/model3d" xmlns:o="urn:schemas-microsoft-com:office:office" xmlns:oel="http://schemas.microsoft.com/office/2019/extlst" xmlns:r="http://schemas.openxmlformats.org/officeDocument/2006/relationships" xmlns:m="http://schemas.openxmlformats.org/officeDocument/2006/math" xmlns:v="urn:schemas-microsoft-com:vml" xmlns:wp14="http://schemas.microsoft.com/office/word/2010/wordprocessingDrawing" xmlns:wp="http://schemas.openxmlformats.org/drawingml/2006/wordprocessingDrawing" xmlns:w10="urn:schemas-microsoft-com:office:word" xmlns:w="http://schemas.openxmlformats.org/wordprocessingml/2006/main" xmlns:w14="http://schemas.microsoft.com/office/word/2010/wordml" xmlns:w15="http://schemas.microsoft.com/office/word/2012/wordml" xmlns:w16cex="http://schemas.microsoft.com/office/word/2018/wordml/cex" xmlns:w16cid="http://schemas.microsoft.com/office/word/2016/wordml/cid" xmlns:w16="http://schemas.microsoft.com/office/word/2018/wordml" xmlns:w16du="http://schemas.microsoft.com/office/word/2023/wordml/word16du" xmlns:w16sdtdh="http://schemas.microsoft.com/office/word/2020/wordml/sdtdatahash" xmlns:w16sdtfl="http://schemas.microsoft.com/office/word/2024/wordml/sdtformatlock" xmlns:w16se="http://schemas.microsoft.com/office/word/2015/wordml/symex" xmlns:wpg="http://schemas.microsoft.com/office/word/2010/wordprocessingGroup" xmlns:wpi="http://schemas.microsoft.com/office/word/2010/wordprocessingInk" xmlns:wne="http://schemas.microsoft.com/office/word/2006/wordml" xmlns:wps="http://schemas.microsoft.com/office/word/2010/wordprocessingShape" mc:Ignorable="w14 w15 w16se w16cid w16 w16cex w16sdtdh w16sdtfl w16du wp14">
   <w:abstractNum w:abstractNumId="0" w15:restartNumberingAfterBreak="0">
+    <w:nsid w:val="0EC70EA4"/>
+    <w:multiLevelType w:val="hybridMultilevel"/>
+    <w:tmpl w:val="DD906AB4"/>
+    <w:lvl w:ilvl="0" w:tplc="04150001">
+      <w:start w:val="1"/>
+      <w:numFmt w:val="bullet"/>
+      <w:lvlText w:val=""/>
+      <w:lvlJc w:val="left"/>
+      <w:pPr>
+        <w:ind w:left="720" w:hanging="360"/>
+      </w:pPr>
+      <w:rPr>
+        <w:rFonts w:ascii="Symbol" w:hAnsi="Symbol" w:hint="default"/>
+      </w:rPr>
+    </w:lvl>
+    <w:lvl w:ilvl="1" w:tplc="04150003" w:tentative="1">
+      <w:start w:val="1"/>
+      <w:numFmt w:val="bullet"/>
+      <w:lvlText w:val="o"/>
+      <w:lvlJc w:val="left"/>
+      <w:pPr>
+        <w:ind w:left="1440" w:hanging="360"/>
+      </w:pPr>
+      <w:rPr>
+        <w:rFonts w:ascii="Courier New" w:hAnsi="Courier New" w:cs="Courier New" w:hint="default"/>
+      </w:rPr>
+    </w:lvl>
+    <w:lvl w:ilvl="2" w:tplc="04150005" w:tentative="1">
+      <w:start w:val="1"/>
+      <w:numFmt w:val="bullet"/>
+      <w:lvlText w:val=""/>
+      <w:lvlJc w:val="left"/>
+      <w:pPr>
+        <w:ind w:left="2160" w:hanging="360"/>
+      </w:pPr>
+      <w:rPr>
+        <w:rFonts w:ascii="Wingdings" w:hAnsi="Wingdings" w:hint="default"/>
+      </w:rPr>
+    </w:lvl>
+    <w:lvl w:ilvl="3" w:tplc="04150001" w:tentative="1">
+      <w:start w:val="1"/>
+      <w:numFmt w:val="bullet"/>
+      <w:lvlText w:val=""/>
+      <w:lvlJc w:val="left"/>
+      <w:pPr>
+        <w:ind w:left="2880" w:hanging="360"/>
+      </w:pPr>
+      <w:rPr>
+        <w:rFonts w:ascii="Symbol" w:hAnsi="Symbol" w:hint="default"/>
+      </w:rPr>
+    </w:lvl>
+    <w:lvl w:ilvl="4" w:tplc="04150003" w:tentative="1">
+      <w:start w:val="1"/>
+      <w:numFmt w:val="bullet"/>
+      <w:lvlText w:val="o"/>
+      <w:lvlJc w:val="left"/>
+      <w:pPr>
+        <w:ind w:left="3600" w:hanging="360"/>
+      </w:pPr>
+      <w:rPr>
+        <w:rFonts w:ascii="Courier New" w:hAnsi="Courier New" w:cs="Courier New" w:hint="default"/>
+      </w:rPr>
+    </w:lvl>
+    <w:lvl w:ilvl="5" w:tplc="04150005" w:tentative="1">
+      <w:start w:val="1"/>
+      <w:numFmt w:val="bullet"/>
+      <w:lvlText w:val=""/>
+      <w:lvlJc w:val="left"/>
+      <w:pPr>
+        <w:ind w:left="4320" w:hanging="360"/>
+      </w:pPr>
+      <w:rPr>
+        <w:rFonts w:ascii="Wingdings" w:hAnsi="Wingdings" w:hint="default"/>
+      </w:rPr>
+    </w:lvl>
+    <w:lvl w:ilvl="6" w:tplc="04150001" w:tentative="1">
+      <w:start w:val="1"/>
+      <w:numFmt w:val="bullet"/>
+      <w:lvlText w:val=""/>
+      <w:lvlJc w:val="left"/>
+      <w:pPr>
+        <w:ind w:left="5040" w:hanging="360"/>
+      </w:pPr>
+      <w:rPr>
+        <w:rFonts w:ascii="Symbol" w:hAnsi="Symbol" w:hint="default"/>
+      </w:rPr>
+    </w:lvl>
+    <w:lvl w:ilvl="7" w:tplc="04150003" w:tentative="1">
+      <w:start w:val="1"/>
+      <w:numFmt w:val="bullet"/>
+      <w:lvlText w:val="o"/>
+      <w:lvlJc w:val="left"/>
+      <w:pPr>
+        <w:ind w:left="5760" w:hanging="360"/>
+      </w:pPr>
+      <w:rPr>
+        <w:rFonts w:ascii="Courier New" w:hAnsi="Courier New" w:cs="Courier New" w:hint="default"/>
+      </w:rPr>
+    </w:lvl>
+    <w:lvl w:ilvl="8" w:tplc="04150005" w:tentative="1">
+      <w:start w:val="1"/>
+      <w:numFmt w:val="bullet"/>
+      <w:lvlText w:val=""/>
+      <w:lvlJc w:val="left"/>
+      <w:pPr>
+        <w:ind w:left="6480" w:hanging="360"/>
+      </w:pPr>
+      <w:rPr>
+        <w:rFonts w:ascii="Wingdings" w:hAnsi="Wingdings" w:hint="default"/>
+      </w:rPr>
+    </w:lvl>
+  </w:abstractNum>
+  <w:abstractNum w:abstractNumId="1" w15:restartNumberingAfterBreak="0">
     <w:nsid w:val="25F43DB8"/>
     <w:multiLevelType w:val="multilevel"/>
     <w:tmpl w:val="4BEC1732"/>
@@ -1887,7 +3206,7 @@
       </w:rPr>
     </w:lvl>
   </w:abstractNum>
-  <w:abstractNum w:abstractNumId="1" w15:restartNumberingAfterBreak="0">
+  <w:abstractNum w:abstractNumId="2" w15:restartNumberingAfterBreak="0">
     <w:nsid w:val="2D9A1FE4"/>
     <w:multiLevelType w:val="multilevel"/>
     <w:tmpl w:val="4BEC1732"/>
@@ -2036,7 +3355,7 @@
       </w:rPr>
     </w:lvl>
   </w:abstractNum>
-  <w:abstractNum w:abstractNumId="2" w15:restartNumberingAfterBreak="0">
+  <w:abstractNum w:abstractNumId="3" w15:restartNumberingAfterBreak="0">
     <w:nsid w:val="36FD4BD6"/>
     <w:multiLevelType w:val="multilevel"/>
     <w:tmpl w:val="296EBA18"/>
@@ -2185,7 +3504,120 @@
       </w:rPr>
     </w:lvl>
   </w:abstractNum>
-  <w:abstractNum w:abstractNumId="3" w15:restartNumberingAfterBreak="0">
+  <w:abstractNum w:abstractNumId="4" w15:restartNumberingAfterBreak="0">
+    <w:nsid w:val="37515538"/>
+    <w:multiLevelType w:val="hybridMultilevel"/>
+    <w:tmpl w:val="0F28F0FA"/>
+    <w:lvl w:ilvl="0" w:tplc="04150001">
+      <w:start w:val="1"/>
+      <w:numFmt w:val="bullet"/>
+      <w:lvlText w:val=""/>
+      <w:lvlJc w:val="left"/>
+      <w:pPr>
+        <w:ind w:left="720" w:hanging="360"/>
+      </w:pPr>
+      <w:rPr>
+        <w:rFonts w:ascii="Symbol" w:hAnsi="Symbol" w:hint="default"/>
+      </w:rPr>
+    </w:lvl>
+    <w:lvl w:ilvl="1" w:tplc="04150003" w:tentative="1">
+      <w:start w:val="1"/>
+      <w:numFmt w:val="bullet"/>
+      <w:lvlText w:val="o"/>
+      <w:lvlJc w:val="left"/>
+      <w:pPr>
+        <w:ind w:left="1440" w:hanging="360"/>
+      </w:pPr>
+      <w:rPr>
+        <w:rFonts w:ascii="Courier New" w:hAnsi="Courier New" w:cs="Courier New" w:hint="default"/>
+      </w:rPr>
+    </w:lvl>
+    <w:lvl w:ilvl="2" w:tplc="04150005" w:tentative="1">
+      <w:start w:val="1"/>
+      <w:numFmt w:val="bullet"/>
+      <w:lvlText w:val=""/>
+      <w:lvlJc w:val="left"/>
+      <w:pPr>
+        <w:ind w:left="2160" w:hanging="360"/>
+      </w:pPr>
+      <w:rPr>
+        <w:rFonts w:ascii="Wingdings" w:hAnsi="Wingdings" w:hint="default"/>
+      </w:rPr>
+    </w:lvl>
+    <w:lvl w:ilvl="3" w:tplc="04150001" w:tentative="1">
+      <w:start w:val="1"/>
+      <w:numFmt w:val="bullet"/>
+      <w:lvlText w:val=""/>
+      <w:lvlJc w:val="left"/>
+      <w:pPr>
+        <w:ind w:left="2880" w:hanging="360"/>
+      </w:pPr>
+      <w:rPr>
+        <w:rFonts w:ascii="Symbol" w:hAnsi="Symbol" w:hint="default"/>
+      </w:rPr>
+    </w:lvl>
+    <w:lvl w:ilvl="4" w:tplc="04150003" w:tentative="1">
+      <w:start w:val="1"/>
+      <w:numFmt w:val="bullet"/>
+      <w:lvlText w:val="o"/>
+      <w:lvlJc w:val="left"/>
+      <w:pPr>
+        <w:ind w:left="3600" w:hanging="360"/>
+      </w:pPr>
+      <w:rPr>
+        <w:rFonts w:ascii="Courier New" w:hAnsi="Courier New" w:cs="Courier New" w:hint="default"/>
+      </w:rPr>
+    </w:lvl>
+    <w:lvl w:ilvl="5" w:tplc="04150005" w:tentative="1">
+      <w:start w:val="1"/>
+      <w:numFmt w:val="bullet"/>
+      <w:lvlText w:val=""/>
+      <w:lvlJc w:val="left"/>
+      <w:pPr>
+        <w:ind w:left="4320" w:hanging="360"/>
+      </w:pPr>
+      <w:rPr>
+        <w:rFonts w:ascii="Wingdings" w:hAnsi="Wingdings" w:hint="default"/>
+      </w:rPr>
+    </w:lvl>
+    <w:lvl w:ilvl="6" w:tplc="04150001" w:tentative="1">
+      <w:start w:val="1"/>
+      <w:numFmt w:val="bullet"/>
+      <w:lvlText w:val=""/>
+      <w:lvlJc w:val="left"/>
+      <w:pPr>
+        <w:ind w:left="5040" w:hanging="360"/>
+      </w:pPr>
+      <w:rPr>
+        <w:rFonts w:ascii="Symbol" w:hAnsi="Symbol" w:hint="default"/>
+      </w:rPr>
+    </w:lvl>
+    <w:lvl w:ilvl="7" w:tplc="04150003" w:tentative="1">
+      <w:start w:val="1"/>
+      <w:numFmt w:val="bullet"/>
+      <w:lvlText w:val="o"/>
+      <w:lvlJc w:val="left"/>
+      <w:pPr>
+        <w:ind w:left="5760" w:hanging="360"/>
+      </w:pPr>
+      <w:rPr>
+        <w:rFonts w:ascii="Courier New" w:hAnsi="Courier New" w:cs="Courier New" w:hint="default"/>
+      </w:rPr>
+    </w:lvl>
+    <w:lvl w:ilvl="8" w:tplc="04150005" w:tentative="1">
+      <w:start w:val="1"/>
+      <w:numFmt w:val="bullet"/>
+      <w:lvlText w:val=""/>
+      <w:lvlJc w:val="left"/>
+      <w:pPr>
+        <w:ind w:left="6480" w:hanging="360"/>
+      </w:pPr>
+      <w:rPr>
+        <w:rFonts w:ascii="Wingdings" w:hAnsi="Wingdings" w:hint="default"/>
+      </w:rPr>
+    </w:lvl>
+  </w:abstractNum>
+  <w:abstractNum w:abstractNumId="5" w15:restartNumberingAfterBreak="0">
     <w:nsid w:val="3ABE4EAB"/>
     <w:multiLevelType w:val="multilevel"/>
     <w:tmpl w:val="4BEC1732"/>
@@ -2334,7 +3766,7 @@
       </w:rPr>
     </w:lvl>
   </w:abstractNum>
-  <w:abstractNum w:abstractNumId="4" w15:restartNumberingAfterBreak="0">
+  <w:abstractNum w:abstractNumId="6" w15:restartNumberingAfterBreak="0">
     <w:nsid w:val="49CD1321"/>
     <w:multiLevelType w:val="hybridMultilevel"/>
     <w:tmpl w:val="1B84F156"/>
@@ -2447,7 +3879,120 @@
       </w:rPr>
     </w:lvl>
   </w:abstractNum>
-  <w:abstractNum w:abstractNumId="5" w15:restartNumberingAfterBreak="0">
+  <w:abstractNum w:abstractNumId="7" w15:restartNumberingAfterBreak="0">
+    <w:nsid w:val="4D0B6295"/>
+    <w:multiLevelType w:val="multilevel"/>
+    <w:tmpl w:val="5AE8FF08"/>
+    <w:lvl w:ilvl="0">
+      <w:start w:val="1"/>
+      <w:numFmt w:val="decimal"/>
+      <w:lvlText w:val="%1."/>
+      <w:lvlJc w:val="left"/>
+      <w:pPr>
+        <w:tabs>
+          <w:tab w:val="num" w:pos="720"/>
+        </w:tabs>
+        <w:ind w:left="720" w:hanging="360"/>
+      </w:pPr>
+    </w:lvl>
+    <w:lvl w:ilvl="1" w:tentative="1">
+      <w:start w:val="1"/>
+      <w:numFmt w:val="decimal"/>
+      <w:lvlText w:val="%2."/>
+      <w:lvlJc w:val="left"/>
+      <w:pPr>
+        <w:tabs>
+          <w:tab w:val="num" w:pos="1440"/>
+        </w:tabs>
+        <w:ind w:left="1440" w:hanging="360"/>
+      </w:pPr>
+    </w:lvl>
+    <w:lvl w:ilvl="2" w:tentative="1">
+      <w:start w:val="1"/>
+      <w:numFmt w:val="decimal"/>
+      <w:lvlText w:val="%3."/>
+      <w:lvlJc w:val="left"/>
+      <w:pPr>
+        <w:tabs>
+          <w:tab w:val="num" w:pos="2160"/>
+        </w:tabs>
+        <w:ind w:left="2160" w:hanging="360"/>
+      </w:pPr>
+    </w:lvl>
+    <w:lvl w:ilvl="3" w:tentative="1">
+      <w:start w:val="1"/>
+      <w:numFmt w:val="decimal"/>
+      <w:lvlText w:val="%4."/>
+      <w:lvlJc w:val="left"/>
+      <w:pPr>
+        <w:tabs>
+          <w:tab w:val="num" w:pos="2880"/>
+        </w:tabs>
+        <w:ind w:left="2880" w:hanging="360"/>
+      </w:pPr>
+    </w:lvl>
+    <w:lvl w:ilvl="4" w:tentative="1">
+      <w:start w:val="1"/>
+      <w:numFmt w:val="decimal"/>
+      <w:lvlText w:val="%5."/>
+      <w:lvlJc w:val="left"/>
+      <w:pPr>
+        <w:tabs>
+          <w:tab w:val="num" w:pos="3600"/>
+        </w:tabs>
+        <w:ind w:left="3600" w:hanging="360"/>
+      </w:pPr>
+    </w:lvl>
+    <w:lvl w:ilvl="5" w:tentative="1">
+      <w:start w:val="1"/>
+      <w:numFmt w:val="decimal"/>
+      <w:lvlText w:val="%6."/>
+      <w:lvlJc w:val="left"/>
+      <w:pPr>
+        <w:tabs>
+          <w:tab w:val="num" w:pos="4320"/>
+        </w:tabs>
+        <w:ind w:left="4320" w:hanging="360"/>
+      </w:pPr>
+    </w:lvl>
+    <w:lvl w:ilvl="6" w:tentative="1">
+      <w:start w:val="1"/>
+      <w:numFmt w:val="decimal"/>
+      <w:lvlText w:val="%7."/>
+      <w:lvlJc w:val="left"/>
+      <w:pPr>
+        <w:tabs>
+          <w:tab w:val="num" w:pos="5040"/>
+        </w:tabs>
+        <w:ind w:left="5040" w:hanging="360"/>
+      </w:pPr>
+    </w:lvl>
+    <w:lvl w:ilvl="7" w:tentative="1">
+      <w:start w:val="1"/>
+      <w:numFmt w:val="decimal"/>
+      <w:lvlText w:val="%8."/>
+      <w:lvlJc w:val="left"/>
+      <w:pPr>
+        <w:tabs>
+          <w:tab w:val="num" w:pos="5760"/>
+        </w:tabs>
+        <w:ind w:left="5760" w:hanging="360"/>
+      </w:pPr>
+    </w:lvl>
+    <w:lvl w:ilvl="8" w:tentative="1">
+      <w:start w:val="1"/>
+      <w:numFmt w:val="decimal"/>
+      <w:lvlText w:val="%9."/>
+      <w:lvlJc w:val="left"/>
+      <w:pPr>
+        <w:tabs>
+          <w:tab w:val="num" w:pos="6480"/>
+        </w:tabs>
+        <w:ind w:left="6480" w:hanging="360"/>
+      </w:pPr>
+    </w:lvl>
+  </w:abstractNum>
+  <w:abstractNum w:abstractNumId="8" w15:restartNumberingAfterBreak="0">
     <w:nsid w:val="63685C3D"/>
     <w:multiLevelType w:val="multilevel"/>
     <w:tmpl w:val="4BEC1732"/>
@@ -2596,7 +4141,7 @@
       </w:rPr>
     </w:lvl>
   </w:abstractNum>
-  <w:abstractNum w:abstractNumId="6" w15:restartNumberingAfterBreak="0">
+  <w:abstractNum w:abstractNumId="9" w15:restartNumberingAfterBreak="0">
     <w:nsid w:val="783B36E5"/>
     <w:multiLevelType w:val="hybridMultilevel"/>
     <w:tmpl w:val="7F4ABC50"/>
@@ -2683,25 +4228,34 @@
     </w:lvl>
   </w:abstractNum>
   <w:num w:numId="1" w16cid:durableId="1514874231">
+    <w:abstractNumId w:val="9"/>
+  </w:num>
+  <w:num w:numId="2" w16cid:durableId="1727796393">
+    <w:abstractNumId w:val="3"/>
+  </w:num>
+  <w:num w:numId="3" w16cid:durableId="1841773993">
     <w:abstractNumId w:val="6"/>
   </w:num>
-  <w:num w:numId="2" w16cid:durableId="1727796393">
+  <w:num w:numId="4" w16cid:durableId="234239484">
     <w:abstractNumId w:val="2"/>
   </w:num>
-  <w:num w:numId="3" w16cid:durableId="1841773993">
+  <w:num w:numId="5" w16cid:durableId="2065830945">
+    <w:abstractNumId w:val="8"/>
+  </w:num>
+  <w:num w:numId="6" w16cid:durableId="1793211220">
+    <w:abstractNumId w:val="1"/>
+  </w:num>
+  <w:num w:numId="7" w16cid:durableId="1183782247">
+    <w:abstractNumId w:val="5"/>
+  </w:num>
+  <w:num w:numId="8" w16cid:durableId="1991014374">
+    <w:abstractNumId w:val="0"/>
+  </w:num>
+  <w:num w:numId="9" w16cid:durableId="1835604107">
     <w:abstractNumId w:val="4"/>
   </w:num>
-  <w:num w:numId="4" w16cid:durableId="234239484">
-    <w:abstractNumId w:val="1"/>
-  </w:num>
-  <w:num w:numId="5" w16cid:durableId="2065830945">
-    <w:abstractNumId w:val="5"/>
-  </w:num>
-  <w:num w:numId="6" w16cid:durableId="1793211220">
-    <w:abstractNumId w:val="0"/>
-  </w:num>
-  <w:num w:numId="7" w16cid:durableId="1183782247">
-    <w:abstractNumId w:val="3"/>
+  <w:num w:numId="10" w16cid:durableId="1089234223">
+    <w:abstractNumId w:val="7"/>
   </w:num>
 </w:numbering>
 </file>

</xml_diff>